<commit_message>
billeder, og små ændringer i koden
</commit_message>
<xml_diff>
--- a/Portfolie.docx
+++ b/Portfolie.docx
@@ -1259,7 +1259,13 @@
         <w:rPr>
           <w:rFonts w:ascii="Times New Roman" w:hAnsi="Times New Roman" w:cs="Times New Roman"/>
         </w:rPr>
-        <w:t>Man skal have:</w:t>
+        <w:t>I sin hjemmeside, skal m</w:t>
+      </w:r>
+      <w:r>
+        <w:rPr>
+          <w:rFonts w:ascii="Times New Roman" w:hAnsi="Times New Roman" w:cs="Times New Roman"/>
+        </w:rPr>
+        <w:t>an skal have:</w:t>
       </w:r>
     </w:p>
     <w:p>
@@ -3868,182 +3874,6 @@
           <w:rFonts w:ascii="Times New Roman" w:hAnsi="Times New Roman" w:cs="Times New Roman"/>
         </w:rPr>
         <w:t> </w:t>
-      </w:r>
-    </w:p>
-    <w:p>
-      <w:pPr>
-        <w:rPr>
-          <w:rFonts w:ascii="Times New Roman" w:hAnsi="Times New Roman" w:cs="Times New Roman"/>
-        </w:rPr>
-      </w:pPr>
-      <w:r>
-        <w:rPr>
-          <w:rFonts w:ascii="Times New Roman" w:hAnsi="Times New Roman" w:cs="Times New Roman"/>
-        </w:rPr>
-        <w:t> </w:t>
-      </w:r>
-    </w:p>
-    <w:p>
-      <w:pPr>
-        <w:rPr>
-          <w:rFonts w:ascii="Times New Roman" w:hAnsi="Times New Roman" w:cs="Times New Roman"/>
-        </w:rPr>
-      </w:pPr>
-      <w:r>
-        <w:rPr>
-          <w:rFonts w:ascii="Times New Roman" w:hAnsi="Times New Roman" w:cs="Times New Roman"/>
-          <w:b/>
-          <w:bCs/>
-        </w:rPr>
-        <w:t>Erfaringer</w:t>
-      </w:r>
-    </w:p>
-    <w:p>
-      <w:pPr>
-        <w:rPr>
-          <w:rFonts w:ascii="Times New Roman" w:hAnsi="Times New Roman" w:cs="Times New Roman"/>
-        </w:rPr>
-      </w:pPr>
-      <w:r>
-        <w:rPr>
-          <w:rFonts w:ascii="Times New Roman" w:hAnsi="Times New Roman" w:cs="Times New Roman"/>
-        </w:rPr>
-        <w:t>I 7 klasse var jeg i samfundspraktik hvor jeg var en uge i praktik i en børnehave. Der var jeg sammen med børnehavebørn, hvor jeg var sammen med dem, legede med dem og sørgede for at de havde det godt. </w:t>
-      </w:r>
-    </w:p>
-    <w:p>
-      <w:pPr>
-        <w:rPr>
-          <w:rFonts w:ascii="Times New Roman" w:hAnsi="Times New Roman" w:cs="Times New Roman"/>
-        </w:rPr>
-      </w:pPr>
-      <w:r>
-        <w:rPr>
-          <w:rFonts w:ascii="Times New Roman" w:hAnsi="Times New Roman" w:cs="Times New Roman"/>
-        </w:rPr>
-        <w:t> </w:t>
-      </w:r>
-      <w:r>
-        <w:rPr>
-          <w:rFonts w:ascii="Times New Roman" w:hAnsi="Times New Roman" w:cs="Times New Roman"/>
-        </w:rPr>
-        <w:t>I 8 klasse var jeg i praktik som landmand.</w:t>
-      </w:r>
-    </w:p>
-    <w:p>
-      <w:pPr>
-        <w:rPr>
-          <w:rFonts w:ascii="Times New Roman" w:hAnsi="Times New Roman" w:cs="Times New Roman"/>
-        </w:rPr>
-      </w:pPr>
-      <w:r>
-        <w:rPr>
-          <w:rFonts w:ascii="Times New Roman" w:hAnsi="Times New Roman" w:cs="Times New Roman"/>
-        </w:rPr>
-        <w:t>Her fik jeg lov til at hjælpe med diverse opgaver, fx at kaste dæk op på en stor bunke/bjerg med korn, hvor der var en presenning over, og så skulle dækkene være øverst. . Jeg fik lov til at prøve at malke en ko, køre en traktor og fodre dyrene.</w:t>
-      </w:r>
-    </w:p>
-    <w:p>
-      <w:pPr>
-        <w:rPr>
-          <w:rFonts w:ascii="Times New Roman" w:hAnsi="Times New Roman" w:cs="Times New Roman"/>
-        </w:rPr>
-      </w:pPr>
-    </w:p>
-    <w:p>
-      <w:pPr>
-        <w:rPr>
-          <w:rFonts w:ascii="Times New Roman" w:hAnsi="Times New Roman" w:cs="Times New Roman"/>
-        </w:rPr>
-      </w:pPr>
-      <w:r>
-        <w:rPr>
-          <w:rFonts w:ascii="Times New Roman" w:hAnsi="Times New Roman" w:cs="Times New Roman"/>
-        </w:rPr>
-        <w:t>I 9 klasse var jeg i drømmepraktik, hvor jeg var i praktik som </w:t>
-      </w:r>
-    </w:p>
-    <w:p>
-      <w:pPr>
-        <w:rPr>
-          <w:rFonts w:ascii="Times New Roman" w:hAnsi="Times New Roman" w:cs="Times New Roman"/>
-        </w:rPr>
-      </w:pPr>
-      <w:r>
-        <w:rPr>
-          <w:rFonts w:ascii="Times New Roman" w:hAnsi="Times New Roman" w:cs="Times New Roman"/>
-        </w:rPr>
-        <w:t>tækkemand, der hjalp jeg med at tække andre menneskers huse. Der </w:t>
-      </w:r>
-    </w:p>
-    <w:p>
-      <w:pPr>
-        <w:rPr>
-          <w:rFonts w:ascii="Times New Roman" w:hAnsi="Times New Roman" w:cs="Times New Roman"/>
-        </w:rPr>
-      </w:pPr>
-      <w:r>
-        <w:rPr>
-          <w:rFonts w:ascii="Times New Roman" w:hAnsi="Times New Roman" w:cs="Times New Roman"/>
-        </w:rPr>
-        <w:t>var der rigtig meget samarbejde og kommunikation. </w:t>
-      </w:r>
-    </w:p>
-    <w:p>
-      <w:pPr>
-        <w:rPr>
-          <w:rFonts w:ascii="Times New Roman" w:hAnsi="Times New Roman" w:cs="Times New Roman"/>
-        </w:rPr>
-      </w:pPr>
-      <w:r>
-        <w:rPr>
-          <w:rFonts w:ascii="Times New Roman" w:hAnsi="Times New Roman" w:cs="Times New Roman"/>
-        </w:rPr>
-        <w:t> </w:t>
-      </w:r>
-    </w:p>
-    <w:p>
-      <w:pPr>
-        <w:rPr>
-          <w:rFonts w:ascii="Times New Roman" w:hAnsi="Times New Roman" w:cs="Times New Roman"/>
-        </w:rPr>
-      </w:pPr>
-      <w:r>
-        <w:rPr>
-          <w:rFonts w:ascii="Times New Roman" w:hAnsi="Times New Roman" w:cs="Times New Roman"/>
-        </w:rPr>
-        <w:t>I 10 klasse var jeg i praktik som skolelærer. Der underviste jeg en klasse i en lektion. Jeg havde meget ansvar, jeg var god til at kommunikere med eleverne og lærerne.</w:t>
-      </w:r>
-      <w:r>
-        <w:rPr>
-          <w:rFonts w:ascii="Times New Roman" w:hAnsi="Times New Roman" w:cs="Times New Roman"/>
-        </w:rPr>
-        <w:t xml:space="preserve"> Det jeg skulle bruge praktikken til, var til min OSO (obligatorisk Selvvalgte Opgave) som man har i 10 klasse. Her havde jeg fokus på hvordan børns trivsel havde været under Corona pandemien. </w:t>
-      </w:r>
-      <w:r>
-        <w:rPr>
-          <w:rFonts w:ascii="Times New Roman" w:hAnsi="Times New Roman" w:cs="Times New Roman"/>
-        </w:rPr>
-        <w:t xml:space="preserve">I opgaven, skulle </w:t>
-      </w:r>
-      <w:r>
-        <w:rPr>
-          <w:rFonts w:ascii="Times New Roman" w:hAnsi="Times New Roman" w:cs="Times New Roman"/>
-        </w:rPr>
-        <w:lastRenderedPageBreak/>
-        <w:t xml:space="preserve">jeg finde en løsning på, hvordan man kunne komme mere tilbage til det sociale fællesskab, efter skolerne åbnede op igen. Grunden til, at jeg ville finde en løsning på det, var at mange unge mennesker, havde meget svært ved at vende tilbage til fysisk undervisning, og skulle være sociale med andre mennesker. Jeg endte med at lave et kreativt produkt, som var en stor skumterning, og til hver af terningens side (øjne) var der en specifik kategori med forskellige spørgsmål, inden for den kategori. Jeg afprøvede mit produkt i mit valgfag, og det </w:t>
-      </w:r>
-      <w:r>
-        <w:rPr>
-          <w:rFonts w:ascii="Times New Roman" w:hAnsi="Times New Roman" w:cs="Times New Roman"/>
-        </w:rPr>
-        <w:t>viste sig, at eleverne var vilde med konceptet</w:t>
-      </w:r>
-      <w:r>
-        <w:rPr>
-          <w:rFonts w:ascii="Times New Roman" w:hAnsi="Times New Roman" w:cs="Times New Roman"/>
-        </w:rPr>
-        <w:t xml:space="preserve">. Det var et meget vellykket projekt, og jeg fik selvfølgelig karakteren 12. </w:t>
       </w:r>
     </w:p>
     <w:p>

</xml_diff>

<commit_message>
Ændret "portfolie" til "portefølje"
</commit_message>
<xml_diff>
--- a/Portfolie.docx
+++ b/Portfolie.docx
@@ -44,7 +44,6 @@
           <w:pPr>
             <w:pStyle w:val="Indholdsfortegnelse1"/>
             <w:tabs>
-              <w:tab w:val="left" w:pos="480"/>
               <w:tab w:val="right" w:leader="dot" w:pos="10456"/>
             </w:tabs>
             <w:rPr>
@@ -71,121 +70,34 @@
             </w:rPr>
             <w:fldChar w:fldCharType="separate"/>
           </w:r>
-          <w:hyperlink w:anchor="_Toc240811417" w:history="1">
+          <w:hyperlink w:anchor="_Toc240967334" w:history="1">
             <w:r>
               <w:rPr>
                 <w:rStyle w:val="Hyperlink"/>
-                <w:rFonts w:cs="Times New Roman"/>
-                <w:noProof/>
-              </w:rPr>
-              <w:t>1.</w:t>
-            </w:r>
-            <w:r>
-              <w:rPr>
-                <w:rFonts w:asciiTheme="minorHAnsi" w:eastAsiaTheme="minorEastAsia" w:hAnsiTheme="minorHAnsi"/>
-                <w:noProof/>
-                <w:lang w:eastAsia="da-DK"/>
+                <w:noProof/>
+              </w:rPr>
+              <w:t>Link til min hjemmeside</w:t>
+            </w:r>
+            <w:r>
+              <w:rPr>
+                <w:noProof/>
+                <w:webHidden/>
               </w:rPr>
               <w:tab/>
             </w:r>
             <w:r>
               <w:rPr>
-                <w:rStyle w:val="Hyperlink"/>
-                <w:rFonts w:cs="Times New Roman"/>
-                <w:noProof/>
-              </w:rPr>
-              <w:t>Indhold</w:t>
-            </w:r>
-            <w:r>
-              <w:rPr>
                 <w:noProof/>
                 <w:webHidden/>
               </w:rPr>
-              <w:tab/>
+              <w:fldChar w:fldCharType="begin"/>
             </w:r>
             <w:r>
               <w:rPr>
                 <w:noProof/>
                 <w:webHidden/>
               </w:rPr>
-              <w:fldChar w:fldCharType="begin"/>
-            </w:r>
-            <w:r>
-              <w:rPr>
-                <w:noProof/>
-                <w:webHidden/>
-              </w:rPr>
-              <w:instrText xml:space="preserve"> PAGEREF _Toc240811417 \h </w:instrText>
-            </w:r>
-            <w:r>
-              <w:rPr>
-                <w:noProof/>
-                <w:webHidden/>
-              </w:rPr>
-            </w:r>
-            <w:r>
-              <w:rPr>
-                <w:noProof/>
-                <w:webHidden/>
-              </w:rPr>
-              <w:fldChar w:fldCharType="separate"/>
-            </w:r>
-            <w:r>
-              <w:rPr>
-                <w:noProof/>
-                <w:webHidden/>
-              </w:rPr>
-              <w:t>1</w:t>
-            </w:r>
-            <w:r>
-              <w:rPr>
-                <w:noProof/>
-                <w:webHidden/>
-              </w:rPr>
-              <w:fldChar w:fldCharType="end"/>
-            </w:r>
-          </w:hyperlink>
-        </w:p>
-        <w:p>
-          <w:pPr>
-            <w:pStyle w:val="Indholdsfortegnelse3"/>
-            <w:tabs>
-              <w:tab w:val="right" w:leader="dot" w:pos="10456"/>
-            </w:tabs>
-            <w:rPr>
-              <w:rFonts w:asciiTheme="minorHAnsi" w:eastAsiaTheme="minorEastAsia" w:hAnsiTheme="minorHAnsi"/>
-              <w:noProof/>
-              <w:lang w:eastAsia="da-DK"/>
-            </w:rPr>
-          </w:pPr>
-          <w:hyperlink w:anchor="_Toc240811418" w:history="1">
-            <w:r>
-              <w:rPr>
-                <w:rStyle w:val="Hyperlink"/>
-                <w:noProof/>
-              </w:rPr>
-              <w:t>Krav til opgaven</w:t>
-            </w:r>
-            <w:r>
-              <w:rPr>
-                <w:noProof/>
-                <w:webHidden/>
-              </w:rPr>
-              <w:tab/>
-            </w:r>
-            <w:r>
-              <w:rPr>
-                <w:noProof/>
-                <w:webHidden/>
-              </w:rPr>
-              <w:fldChar w:fldCharType="begin"/>
-            </w:r>
-            <w:r>
-              <w:rPr>
-                <w:noProof/>
-                <w:webHidden/>
-              </w:rPr>
-              <w:instrText xml:space="preserve"> PAGEREF _Toc240811418 \h </w:instrText>
+              <w:instrText xml:space="preserve"> PAGEREF _Toc240967334 \h </w:instrText>
             </w:r>
             <w:r>
               <w:rPr>
@@ -229,14 +141,14 @@
               <w:lang w:eastAsia="da-DK"/>
             </w:rPr>
           </w:pPr>
-          <w:hyperlink w:anchor="_Toc240811419" w:history="1">
+          <w:hyperlink w:anchor="_Toc240967335" w:history="1">
             <w:r>
               <w:rPr>
                 <w:rStyle w:val="Hyperlink"/>
                 <w:rFonts w:cs="Times New Roman"/>
                 <w:noProof/>
               </w:rPr>
-              <w:t>2.</w:t>
+              <w:t>1.</w:t>
             </w:r>
             <w:r>
               <w:rPr>
@@ -252,7 +164,7 @@
                 <w:rFonts w:cs="Times New Roman"/>
                 <w:noProof/>
               </w:rPr>
-              <w:t>Scope</w:t>
+              <w:t>Indhold</w:t>
             </w:r>
             <w:r>
               <w:rPr>
@@ -273,7 +185,7 @@
                 <w:noProof/>
                 <w:webHidden/>
               </w:rPr>
-              <w:instrText xml:space="preserve"> PAGEREF _Toc240811419 \h </w:instrText>
+              <w:instrText xml:space="preserve"> PAGEREF _Toc240967335 \h </w:instrText>
             </w:r>
             <w:r>
               <w:rPr>
@@ -293,7 +205,7 @@
                 <w:noProof/>
                 <w:webHidden/>
               </w:rPr>
-              <w:t>2</w:t>
+              <w:t>1</w:t>
             </w:r>
             <w:r>
               <w:rPr>
@@ -316,14 +228,13 @@
               <w:lang w:eastAsia="da-DK"/>
             </w:rPr>
           </w:pPr>
-          <w:hyperlink w:anchor="_Toc240811420" w:history="1">
+          <w:hyperlink w:anchor="_Toc240967336" w:history="1">
             <w:r>
               <w:rPr>
                 <w:rStyle w:val="Hyperlink"/>
-                <w:rFonts w:cs="Times New Roman"/>
-                <w:noProof/>
-              </w:rPr>
-              <w:t>Ting der er inden i vores scope  i vores portfolie</w:t>
+                <w:noProof/>
+              </w:rPr>
+              <w:t>Krav til opgaven</w:t>
             </w:r>
             <w:r>
               <w:rPr>
@@ -344,7 +255,7 @@
                 <w:noProof/>
                 <w:webHidden/>
               </w:rPr>
-              <w:instrText xml:space="preserve"> PAGEREF _Toc240811420 \h </w:instrText>
+              <w:instrText xml:space="preserve"> PAGEREF _Toc240967336 \h </w:instrText>
             </w:r>
             <w:r>
               <w:rPr>
@@ -364,78 +275,7 @@
                 <w:noProof/>
                 <w:webHidden/>
               </w:rPr>
-              <w:t>2</w:t>
-            </w:r>
-            <w:r>
-              <w:rPr>
-                <w:noProof/>
-                <w:webHidden/>
-              </w:rPr>
-              <w:fldChar w:fldCharType="end"/>
-            </w:r>
-          </w:hyperlink>
-        </w:p>
-        <w:p>
-          <w:pPr>
-            <w:pStyle w:val="Indholdsfortegnelse3"/>
-            <w:tabs>
-              <w:tab w:val="right" w:leader="dot" w:pos="10456"/>
-            </w:tabs>
-            <w:rPr>
-              <w:rFonts w:asciiTheme="minorHAnsi" w:eastAsiaTheme="minorEastAsia" w:hAnsiTheme="minorHAnsi"/>
-              <w:noProof/>
-              <w:lang w:eastAsia="da-DK"/>
-            </w:rPr>
-          </w:pPr>
-          <w:hyperlink w:anchor="_Toc240811421" w:history="1">
-            <w:r>
-              <w:rPr>
-                <w:rStyle w:val="Hyperlink"/>
-                <w:rFonts w:cs="Times New Roman"/>
-                <w:noProof/>
-              </w:rPr>
-              <w:t>Ting der er udenfor vores scope i vores portfolie</w:t>
-            </w:r>
-            <w:r>
-              <w:rPr>
-                <w:noProof/>
-                <w:webHidden/>
-              </w:rPr>
-              <w:tab/>
-            </w:r>
-            <w:r>
-              <w:rPr>
-                <w:noProof/>
-                <w:webHidden/>
-              </w:rPr>
-              <w:fldChar w:fldCharType="begin"/>
-            </w:r>
-            <w:r>
-              <w:rPr>
-                <w:noProof/>
-                <w:webHidden/>
-              </w:rPr>
-              <w:instrText xml:space="preserve"> PAGEREF _Toc240811421 \h </w:instrText>
-            </w:r>
-            <w:r>
-              <w:rPr>
-                <w:noProof/>
-                <w:webHidden/>
-              </w:rPr>
-            </w:r>
-            <w:r>
-              <w:rPr>
-                <w:noProof/>
-                <w:webHidden/>
-              </w:rPr>
-              <w:fldChar w:fldCharType="separate"/>
-            </w:r>
-            <w:r>
-              <w:rPr>
-                <w:noProof/>
-                <w:webHidden/>
-              </w:rPr>
-              <w:t>2</w:t>
+              <w:t>1</w:t>
             </w:r>
             <w:r>
               <w:rPr>
@@ -459,14 +299,14 @@
               <w:lang w:eastAsia="da-DK"/>
             </w:rPr>
           </w:pPr>
-          <w:hyperlink w:anchor="_Toc240811422" w:history="1">
+          <w:hyperlink w:anchor="_Toc240967337" w:history="1">
             <w:r>
               <w:rPr>
                 <w:rStyle w:val="Hyperlink"/>
                 <w:rFonts w:cs="Times New Roman"/>
                 <w:noProof/>
               </w:rPr>
-              <w:t>3.</w:t>
+              <w:t>2.</w:t>
             </w:r>
             <w:r>
               <w:rPr>
@@ -482,7 +322,7 @@
                 <w:rFonts w:cs="Times New Roman"/>
                 <w:noProof/>
               </w:rPr>
-              <w:t>WBS</w:t>
+              <w:t>Scope</w:t>
             </w:r>
             <w:r>
               <w:rPr>
@@ -503,7 +343,7 @@
                 <w:noProof/>
                 <w:webHidden/>
               </w:rPr>
-              <w:instrText xml:space="preserve"> PAGEREF _Toc240811422 \h </w:instrText>
+              <w:instrText xml:space="preserve"> PAGEREF _Toc240967337 \h </w:instrText>
             </w:r>
             <w:r>
               <w:rPr>
@@ -523,7 +363,149 @@
                 <w:noProof/>
                 <w:webHidden/>
               </w:rPr>
-              <w:t>3</w:t>
+              <w:t>2</w:t>
+            </w:r>
+            <w:r>
+              <w:rPr>
+                <w:noProof/>
+                <w:webHidden/>
+              </w:rPr>
+              <w:fldChar w:fldCharType="end"/>
+            </w:r>
+          </w:hyperlink>
+        </w:p>
+        <w:p>
+          <w:pPr>
+            <w:pStyle w:val="Indholdsfortegnelse3"/>
+            <w:tabs>
+              <w:tab w:val="right" w:leader="dot" w:pos="10456"/>
+            </w:tabs>
+            <w:rPr>
+              <w:rFonts w:asciiTheme="minorHAnsi" w:eastAsiaTheme="minorEastAsia" w:hAnsiTheme="minorHAnsi"/>
+              <w:noProof/>
+              <w:lang w:eastAsia="da-DK"/>
+            </w:rPr>
+          </w:pPr>
+          <w:hyperlink w:anchor="_Toc240967338" w:history="1">
+            <w:r>
+              <w:rPr>
+                <w:rStyle w:val="Hyperlink"/>
+                <w:rFonts w:cs="Times New Roman"/>
+                <w:noProof/>
+              </w:rPr>
+              <w:t>Ting der er inden i vores scope  i vores portfolie</w:t>
+            </w:r>
+            <w:r>
+              <w:rPr>
+                <w:noProof/>
+                <w:webHidden/>
+              </w:rPr>
+              <w:tab/>
+            </w:r>
+            <w:r>
+              <w:rPr>
+                <w:noProof/>
+                <w:webHidden/>
+              </w:rPr>
+              <w:fldChar w:fldCharType="begin"/>
+            </w:r>
+            <w:r>
+              <w:rPr>
+                <w:noProof/>
+                <w:webHidden/>
+              </w:rPr>
+              <w:instrText xml:space="preserve"> PAGEREF _Toc240967338 \h </w:instrText>
+            </w:r>
+            <w:r>
+              <w:rPr>
+                <w:noProof/>
+                <w:webHidden/>
+              </w:rPr>
+            </w:r>
+            <w:r>
+              <w:rPr>
+                <w:noProof/>
+                <w:webHidden/>
+              </w:rPr>
+              <w:fldChar w:fldCharType="separate"/>
+            </w:r>
+            <w:r>
+              <w:rPr>
+                <w:noProof/>
+                <w:webHidden/>
+              </w:rPr>
+              <w:t>2</w:t>
+            </w:r>
+            <w:r>
+              <w:rPr>
+                <w:noProof/>
+                <w:webHidden/>
+              </w:rPr>
+              <w:fldChar w:fldCharType="end"/>
+            </w:r>
+          </w:hyperlink>
+        </w:p>
+        <w:p>
+          <w:pPr>
+            <w:pStyle w:val="Indholdsfortegnelse3"/>
+            <w:tabs>
+              <w:tab w:val="right" w:leader="dot" w:pos="10456"/>
+            </w:tabs>
+            <w:rPr>
+              <w:rFonts w:asciiTheme="minorHAnsi" w:eastAsiaTheme="minorEastAsia" w:hAnsiTheme="minorHAnsi"/>
+              <w:noProof/>
+              <w:lang w:eastAsia="da-DK"/>
+            </w:rPr>
+          </w:pPr>
+          <w:hyperlink w:anchor="_Toc240967339" w:history="1">
+            <w:r>
+              <w:rPr>
+                <w:rStyle w:val="Hyperlink"/>
+                <w:rFonts w:cs="Times New Roman"/>
+                <w:noProof/>
+              </w:rPr>
+              <w:t>Ting der er udenfor vores scope i vores portfolie</w:t>
+            </w:r>
+            <w:r>
+              <w:rPr>
+                <w:noProof/>
+                <w:webHidden/>
+              </w:rPr>
+              <w:tab/>
+            </w:r>
+            <w:r>
+              <w:rPr>
+                <w:noProof/>
+                <w:webHidden/>
+              </w:rPr>
+              <w:fldChar w:fldCharType="begin"/>
+            </w:r>
+            <w:r>
+              <w:rPr>
+                <w:noProof/>
+                <w:webHidden/>
+              </w:rPr>
+              <w:instrText xml:space="preserve"> PAGEREF _Toc240967339 \h </w:instrText>
+            </w:r>
+            <w:r>
+              <w:rPr>
+                <w:noProof/>
+                <w:webHidden/>
+              </w:rPr>
+            </w:r>
+            <w:r>
+              <w:rPr>
+                <w:noProof/>
+                <w:webHidden/>
+              </w:rPr>
+              <w:fldChar w:fldCharType="separate"/>
+            </w:r>
+            <w:r>
+              <w:rPr>
+                <w:noProof/>
+                <w:webHidden/>
+              </w:rPr>
+              <w:t>2</w:t>
             </w:r>
             <w:r>
               <w:rPr>
@@ -547,14 +529,14 @@
               <w:lang w:eastAsia="da-DK"/>
             </w:rPr>
           </w:pPr>
-          <w:hyperlink w:anchor="_Toc240811423" w:history="1">
+          <w:hyperlink w:anchor="_Toc240967340" w:history="1">
             <w:r>
               <w:rPr>
                 <w:rStyle w:val="Hyperlink"/>
                 <w:rFonts w:cs="Times New Roman"/>
                 <w:noProof/>
               </w:rPr>
-              <w:t>4.</w:t>
+              <w:t>3.</w:t>
             </w:r>
             <w:r>
               <w:rPr>
@@ -570,7 +552,7 @@
                 <w:rFonts w:cs="Times New Roman"/>
                 <w:noProof/>
               </w:rPr>
-              <w:t>Estimering</w:t>
+              <w:t>WBS</w:t>
             </w:r>
             <w:r>
               <w:rPr>
@@ -591,7 +573,7 @@
                 <w:noProof/>
                 <w:webHidden/>
               </w:rPr>
-              <w:instrText xml:space="preserve"> PAGEREF _Toc240811423 \h </w:instrText>
+              <w:instrText xml:space="preserve"> PAGEREF _Toc240967340 \h </w:instrText>
             </w:r>
             <w:r>
               <w:rPr>
@@ -611,7 +593,7 @@
                 <w:noProof/>
                 <w:webHidden/>
               </w:rPr>
-              <w:t>4</w:t>
+              <w:t>3</w:t>
             </w:r>
             <w:r>
               <w:rPr>
@@ -635,14 +617,14 @@
               <w:lang w:eastAsia="da-DK"/>
             </w:rPr>
           </w:pPr>
-          <w:hyperlink w:anchor="_Toc240811424" w:history="1">
+          <w:hyperlink w:anchor="_Toc240967341" w:history="1">
             <w:r>
               <w:rPr>
                 <w:rStyle w:val="Hyperlink"/>
                 <w:rFonts w:cs="Times New Roman"/>
                 <w:noProof/>
               </w:rPr>
-              <w:t>5.</w:t>
+              <w:t>4.</w:t>
             </w:r>
             <w:r>
               <w:rPr>
@@ -658,7 +640,7 @@
                 <w:rFonts w:cs="Times New Roman"/>
                 <w:noProof/>
               </w:rPr>
-              <w:t>Ganttkort</w:t>
+              <w:t>Estimering</w:t>
             </w:r>
             <w:r>
               <w:rPr>
@@ -679,7 +661,7 @@
                 <w:noProof/>
                 <w:webHidden/>
               </w:rPr>
-              <w:instrText xml:space="preserve"> PAGEREF _Toc240811424 \h </w:instrText>
+              <w:instrText xml:space="preserve"> PAGEREF _Toc240967341 \h </w:instrText>
             </w:r>
             <w:r>
               <w:rPr>
@@ -723,14 +705,14 @@
               <w:lang w:eastAsia="da-DK"/>
             </w:rPr>
           </w:pPr>
-          <w:hyperlink w:anchor="_Toc240811425" w:history="1">
+          <w:hyperlink w:anchor="_Toc240967342" w:history="1">
             <w:r>
               <w:rPr>
                 <w:rStyle w:val="Hyperlink"/>
                 <w:rFonts w:cs="Times New Roman"/>
                 <w:noProof/>
               </w:rPr>
-              <w:t>6.</w:t>
+              <w:t>5.</w:t>
             </w:r>
             <w:r>
               <w:rPr>
@@ -746,7 +728,7 @@
                 <w:rFonts w:cs="Times New Roman"/>
                 <w:noProof/>
               </w:rPr>
-              <w:t>Logbog</w:t>
+              <w:t>Ganttkort</w:t>
             </w:r>
             <w:r>
               <w:rPr>
@@ -767,7 +749,7 @@
                 <w:noProof/>
                 <w:webHidden/>
               </w:rPr>
-              <w:instrText xml:space="preserve"> PAGEREF _Toc240811425 \h </w:instrText>
+              <w:instrText xml:space="preserve"> PAGEREF _Toc240967342 \h </w:instrText>
             </w:r>
             <w:r>
               <w:rPr>
@@ -811,14 +793,14 @@
               <w:lang w:eastAsia="da-DK"/>
             </w:rPr>
           </w:pPr>
-          <w:hyperlink w:anchor="_Toc240811426" w:history="1">
+          <w:hyperlink w:anchor="_Toc240967343" w:history="1">
             <w:r>
               <w:rPr>
                 <w:rStyle w:val="Hyperlink"/>
                 <w:rFonts w:cs="Times New Roman"/>
                 <w:noProof/>
               </w:rPr>
-              <w:t>7.</w:t>
+              <w:t>6.</w:t>
             </w:r>
             <w:r>
               <w:rPr>
@@ -834,7 +816,7 @@
                 <w:rFonts w:cs="Times New Roman"/>
                 <w:noProof/>
               </w:rPr>
-              <w:t>Prioritering</w:t>
+              <w:t>Logbog</w:t>
             </w:r>
             <w:r>
               <w:rPr>
@@ -855,7 +837,7 @@
                 <w:noProof/>
                 <w:webHidden/>
               </w:rPr>
-              <w:instrText xml:space="preserve"> PAGEREF _Toc240811426 \h </w:instrText>
+              <w:instrText xml:space="preserve"> PAGEREF _Toc240967343 \h </w:instrText>
             </w:r>
             <w:r>
               <w:rPr>
@@ -875,78 +857,7 @@
                 <w:noProof/>
                 <w:webHidden/>
               </w:rPr>
-              <w:t>5</w:t>
-            </w:r>
-            <w:r>
-              <w:rPr>
-                <w:noProof/>
-                <w:webHidden/>
-              </w:rPr>
-              <w:fldChar w:fldCharType="end"/>
-            </w:r>
-          </w:hyperlink>
-        </w:p>
-        <w:p>
-          <w:pPr>
-            <w:pStyle w:val="Indholdsfortegnelse2"/>
-            <w:tabs>
-              <w:tab w:val="right" w:leader="dot" w:pos="10456"/>
-            </w:tabs>
-            <w:rPr>
-              <w:rFonts w:asciiTheme="minorHAnsi" w:eastAsiaTheme="minorEastAsia" w:hAnsiTheme="minorHAnsi"/>
-              <w:noProof/>
-              <w:lang w:eastAsia="da-DK"/>
-            </w:rPr>
-          </w:pPr>
-          <w:hyperlink w:anchor="_Toc240811427" w:history="1">
-            <w:r>
-              <w:rPr>
-                <w:rStyle w:val="Hyperlink"/>
-                <w:rFonts w:cs="Times New Roman"/>
-                <w:noProof/>
-              </w:rPr>
-              <w:t>Moscow</w:t>
-            </w:r>
-            <w:r>
-              <w:rPr>
-                <w:noProof/>
-                <w:webHidden/>
-              </w:rPr>
-              <w:tab/>
-            </w:r>
-            <w:r>
-              <w:rPr>
-                <w:noProof/>
-                <w:webHidden/>
-              </w:rPr>
-              <w:fldChar w:fldCharType="begin"/>
-            </w:r>
-            <w:r>
-              <w:rPr>
-                <w:noProof/>
-                <w:webHidden/>
-              </w:rPr>
-              <w:instrText xml:space="preserve"> PAGEREF _Toc240811427 \h </w:instrText>
-            </w:r>
-            <w:r>
-              <w:rPr>
-                <w:noProof/>
-                <w:webHidden/>
-              </w:rPr>
-            </w:r>
-            <w:r>
-              <w:rPr>
-                <w:noProof/>
-                <w:webHidden/>
-              </w:rPr>
-              <w:fldChar w:fldCharType="separate"/>
-            </w:r>
-            <w:r>
-              <w:rPr>
-                <w:noProof/>
-                <w:webHidden/>
-              </w:rPr>
-              <w:t>5</w:t>
+              <w:t>4</w:t>
             </w:r>
             <w:r>
               <w:rPr>
@@ -970,13 +881,172 @@
               <w:lang w:eastAsia="da-DK"/>
             </w:rPr>
           </w:pPr>
-          <w:hyperlink w:anchor="_Toc240811428" w:history="1">
+          <w:hyperlink w:anchor="_Toc240967344" w:history="1">
             <w:r>
               <w:rPr>
                 <w:rStyle w:val="Hyperlink"/>
                 <w:rFonts w:cs="Times New Roman"/>
                 <w:noProof/>
               </w:rPr>
+              <w:t>7.</w:t>
+            </w:r>
+            <w:r>
+              <w:rPr>
+                <w:rFonts w:asciiTheme="minorHAnsi" w:eastAsiaTheme="minorEastAsia" w:hAnsiTheme="minorHAnsi"/>
+                <w:noProof/>
+                <w:lang w:eastAsia="da-DK"/>
+              </w:rPr>
+              <w:tab/>
+            </w:r>
+            <w:r>
+              <w:rPr>
+                <w:rStyle w:val="Hyperlink"/>
+                <w:rFonts w:cs="Times New Roman"/>
+                <w:noProof/>
+              </w:rPr>
+              <w:t>Prioritering</w:t>
+            </w:r>
+            <w:r>
+              <w:rPr>
+                <w:noProof/>
+                <w:webHidden/>
+              </w:rPr>
+              <w:tab/>
+            </w:r>
+            <w:r>
+              <w:rPr>
+                <w:noProof/>
+                <w:webHidden/>
+              </w:rPr>
+              <w:fldChar w:fldCharType="begin"/>
+            </w:r>
+            <w:r>
+              <w:rPr>
+                <w:noProof/>
+                <w:webHidden/>
+              </w:rPr>
+              <w:instrText xml:space="preserve"> PAGEREF _Toc240967344 \h </w:instrText>
+            </w:r>
+            <w:r>
+              <w:rPr>
+                <w:noProof/>
+                <w:webHidden/>
+              </w:rPr>
+            </w:r>
+            <w:r>
+              <w:rPr>
+                <w:noProof/>
+                <w:webHidden/>
+              </w:rPr>
+              <w:fldChar w:fldCharType="separate"/>
+            </w:r>
+            <w:r>
+              <w:rPr>
+                <w:noProof/>
+                <w:webHidden/>
+              </w:rPr>
+              <w:t>6</w:t>
+            </w:r>
+            <w:r>
+              <w:rPr>
+                <w:noProof/>
+                <w:webHidden/>
+              </w:rPr>
+              <w:fldChar w:fldCharType="end"/>
+            </w:r>
+          </w:hyperlink>
+        </w:p>
+        <w:p>
+          <w:pPr>
+            <w:pStyle w:val="Indholdsfortegnelse2"/>
+            <w:tabs>
+              <w:tab w:val="right" w:leader="dot" w:pos="10456"/>
+            </w:tabs>
+            <w:rPr>
+              <w:rFonts w:asciiTheme="minorHAnsi" w:eastAsiaTheme="minorEastAsia" w:hAnsiTheme="minorHAnsi"/>
+              <w:noProof/>
+              <w:lang w:eastAsia="da-DK"/>
+            </w:rPr>
+          </w:pPr>
+          <w:hyperlink w:anchor="_Toc240967345" w:history="1">
+            <w:r>
+              <w:rPr>
+                <w:rStyle w:val="Hyperlink"/>
+                <w:rFonts w:cs="Times New Roman"/>
+                <w:noProof/>
+              </w:rPr>
+              <w:t>Moscow</w:t>
+            </w:r>
+            <w:r>
+              <w:rPr>
+                <w:noProof/>
+                <w:webHidden/>
+              </w:rPr>
+              <w:tab/>
+            </w:r>
+            <w:r>
+              <w:rPr>
+                <w:noProof/>
+                <w:webHidden/>
+              </w:rPr>
+              <w:fldChar w:fldCharType="begin"/>
+            </w:r>
+            <w:r>
+              <w:rPr>
+                <w:noProof/>
+                <w:webHidden/>
+              </w:rPr>
+              <w:instrText xml:space="preserve"> PAGEREF _Toc240967345 \h </w:instrText>
+            </w:r>
+            <w:r>
+              <w:rPr>
+                <w:noProof/>
+                <w:webHidden/>
+              </w:rPr>
+            </w:r>
+            <w:r>
+              <w:rPr>
+                <w:noProof/>
+                <w:webHidden/>
+              </w:rPr>
+              <w:fldChar w:fldCharType="separate"/>
+            </w:r>
+            <w:r>
+              <w:rPr>
+                <w:noProof/>
+                <w:webHidden/>
+              </w:rPr>
+              <w:t>6</w:t>
+            </w:r>
+            <w:r>
+              <w:rPr>
+                <w:noProof/>
+                <w:webHidden/>
+              </w:rPr>
+              <w:fldChar w:fldCharType="end"/>
+            </w:r>
+          </w:hyperlink>
+        </w:p>
+        <w:p>
+          <w:pPr>
+            <w:pStyle w:val="Indholdsfortegnelse1"/>
+            <w:tabs>
+              <w:tab w:val="left" w:pos="480"/>
+              <w:tab w:val="right" w:leader="dot" w:pos="10456"/>
+            </w:tabs>
+            <w:rPr>
+              <w:rFonts w:asciiTheme="minorHAnsi" w:eastAsiaTheme="minorEastAsia" w:hAnsiTheme="minorHAnsi"/>
+              <w:noProof/>
+              <w:lang w:eastAsia="da-DK"/>
+            </w:rPr>
+          </w:pPr>
+          <w:hyperlink w:anchor="_Toc240967346" w:history="1">
+            <w:r>
+              <w:rPr>
+                <w:rStyle w:val="Hyperlink"/>
+                <w:rFonts w:cs="Times New Roman"/>
+                <w:noProof/>
+              </w:rPr>
               <w:t>8.</w:t>
             </w:r>
             <w:r>
@@ -1014,7 +1084,7 @@
                 <w:noProof/>
                 <w:webHidden/>
               </w:rPr>
-              <w:instrText xml:space="preserve"> PAGEREF _Toc240811428 \h </w:instrText>
+              <w:instrText xml:space="preserve"> PAGEREF _Toc240967346 \h </w:instrText>
             </w:r>
             <w:r>
               <w:rPr>
@@ -1064,11 +1134,24 @@
     </w:sdt>
     <w:p>
       <w:pPr>
-        <w:ind w:left="720" w:hanging="360"/>
-        <w:rPr>
-          <w:rFonts w:cs="Times New Roman"/>
-        </w:rPr>
-      </w:pPr>
+        <w:pStyle w:val="Overskrift1"/>
+        <w:ind w:left="360"/>
+      </w:pPr>
+      <w:bookmarkStart w:id="0" w:name="_Toc240967334"/>
+      <w:r>
+        <w:t>Link til min hjemmeside</w:t>
+      </w:r>
+      <w:bookmarkEnd w:id="0"/>
+    </w:p>
+    <w:p>
+      <w:hyperlink r:id="rId6" w:history="1">
+        <w:r>
+          <w:rPr>
+            <w:rStyle w:val="Hyperlink"/>
+          </w:rPr>
+          <w:t>https://emmasortkjaer.github.io/portfolie1/</w:t>
+        </w:r>
+      </w:hyperlink>
     </w:p>
     <w:p>
       <w:pPr>
@@ -1081,27 +1164,27 @@
           <w:rFonts w:cs="Times New Roman"/>
         </w:rPr>
       </w:pPr>
-      <w:bookmarkStart w:id="0" w:name="_Toc240811417"/>
+      <w:bookmarkStart w:id="1" w:name="_Toc240967335"/>
       <w:r>
         <w:rPr>
           <w:rFonts w:cs="Times New Roman"/>
         </w:rPr>
         <w:t>Indhold</w:t>
       </w:r>
-      <w:bookmarkEnd w:id="0"/>
+      <w:bookmarkEnd w:id="1"/>
     </w:p>
     <w:p>
       <w:pPr>
         <w:pStyle w:val="Overskrift3"/>
       </w:pPr>
-      <w:bookmarkStart w:id="1" w:name="_Toc240811418"/>
+      <w:bookmarkStart w:id="2" w:name="_Toc240967336"/>
       <w:r>
         <w:t xml:space="preserve">Krav </w:t>
       </w:r>
       <w:r>
         <w:t>til opgaven</w:t>
       </w:r>
-      <w:bookmarkEnd w:id="1"/>
+      <w:bookmarkEnd w:id="2"/>
     </w:p>
     <w:p>
       <w:pPr>
@@ -1332,6 +1415,7 @@
         <w:rPr>
           <w:rFonts w:cs="Times New Roman"/>
         </w:rPr>
+        <w:lastRenderedPageBreak/>
         <w:t xml:space="preserve">Farver </w:t>
       </w:r>
     </w:p>
@@ -1382,7 +1466,6 @@
         <w:rPr>
           <w:rFonts w:cs="Times New Roman"/>
         </w:rPr>
-        <w:lastRenderedPageBreak/>
         <w:t>Scope</w:t>
       </w:r>
       <w:proofErr w:type="spellEnd"/>
@@ -1658,14 +1741,14 @@
           <w:rFonts w:cs="Times New Roman"/>
         </w:rPr>
       </w:pPr>
-      <w:bookmarkStart w:id="2" w:name="_Toc240811419"/>
+      <w:bookmarkStart w:id="3" w:name="_Toc240967337"/>
       <w:r>
         <w:rPr>
           <w:rFonts w:cs="Times New Roman"/>
         </w:rPr>
         <w:t>Scope</w:t>
       </w:r>
-      <w:bookmarkEnd w:id="2"/>
+      <w:bookmarkEnd w:id="3"/>
     </w:p>
     <w:p>
       <w:pPr>
@@ -1674,14 +1757,14 @@
           <w:rFonts w:cs="Times New Roman"/>
         </w:rPr>
       </w:pPr>
-      <w:bookmarkStart w:id="3" w:name="_Toc240811420"/>
+      <w:bookmarkStart w:id="4" w:name="_Toc240967338"/>
       <w:r>
         <w:rPr>
           <w:rFonts w:cs="Times New Roman"/>
         </w:rPr>
         <w:t>Ting der er inden i vores scope  i vores portfolie</w:t>
       </w:r>
-      <w:bookmarkEnd w:id="3"/>
+      <w:bookmarkEnd w:id="4"/>
     </w:p>
     <w:p>
       <w:pPr>
@@ -1839,14 +1922,14 @@
           <w:rFonts w:cs="Times New Roman"/>
         </w:rPr>
       </w:pPr>
-      <w:bookmarkStart w:id="4" w:name="_Toc240811421"/>
+      <w:bookmarkStart w:id="5" w:name="_Toc240967339"/>
       <w:r>
         <w:rPr>
           <w:rFonts w:cs="Times New Roman"/>
         </w:rPr>
         <w:t>Ting der er udenfor vores scope i vores portfolie</w:t>
       </w:r>
-      <w:bookmarkEnd w:id="4"/>
+      <w:bookmarkEnd w:id="5"/>
     </w:p>
     <w:p>
       <w:pPr>
@@ -1879,6 +1962,7 @@
         <w:rPr>
           <w:rFonts w:cs="Times New Roman"/>
         </w:rPr>
+        <w:lastRenderedPageBreak/>
         <w:t>Vibe-coding</w:t>
       </w:r>
     </w:p>
@@ -1926,7 +2010,6 @@
         <w:rPr>
           <w:rFonts w:cs="Times New Roman"/>
         </w:rPr>
-        <w:lastRenderedPageBreak/>
         <w:t> </w:t>
       </w:r>
     </w:p>
@@ -1967,14 +2050,14 @@
           <w:rFonts w:cs="Times New Roman"/>
         </w:rPr>
       </w:pPr>
-      <w:bookmarkStart w:id="5" w:name="_Toc240811422"/>
+      <w:bookmarkStart w:id="6" w:name="_Toc240967340"/>
       <w:r>
         <w:rPr>
           <w:rFonts w:cs="Times New Roman"/>
         </w:rPr>
         <w:t>WBS</w:t>
       </w:r>
-      <w:bookmarkEnd w:id="5"/>
+      <w:bookmarkEnd w:id="6"/>
     </w:p>
     <w:p>
       <w:r>
@@ -2296,15 +2379,14 @@
           <w:rFonts w:cs="Times New Roman"/>
         </w:rPr>
       </w:pPr>
-      <w:bookmarkStart w:id="6" w:name="_Toc240811423"/>
-      <w:r>
-        <w:rPr>
-          <w:rFonts w:cs="Times New Roman"/>
-        </w:rPr>
-        <w:lastRenderedPageBreak/>
+      <w:bookmarkStart w:id="7" w:name="_Toc240967341"/>
+      <w:r>
+        <w:rPr>
+          <w:rFonts w:cs="Times New Roman"/>
+        </w:rPr>
         <w:t>Estimering</w:t>
       </w:r>
-      <w:bookmarkEnd w:id="6"/>
+      <w:bookmarkEnd w:id="7"/>
     </w:p>
     <w:tbl>
       <w:tblPr>
@@ -2637,7 +2719,7 @@
           <w:rFonts w:cs="Times New Roman"/>
         </w:rPr>
       </w:pPr>
-      <w:bookmarkStart w:id="7" w:name="_Toc240811424"/>
+      <w:bookmarkStart w:id="8" w:name="_Toc240967342"/>
       <w:r>
         <w:rPr>
           <w:rFonts w:cs="Times New Roman"/>
@@ -2656,7 +2738,7 @@
         </w:rPr>
         <w:t>kort</w:t>
       </w:r>
-      <w:bookmarkEnd w:id="7"/>
+      <w:bookmarkEnd w:id="8"/>
     </w:p>
     <w:p>
       <w:pPr>
@@ -2684,7 +2766,7 @@
                     <pic:cNvPicPr/>
                   </pic:nvPicPr>
                   <pic:blipFill>
-                    <a:blip r:embed="rId6"/>
+                    <a:blip r:embed="rId7"/>
                     <a:stretch>
                       <a:fillRect/>
                     </a:stretch>
@@ -2716,14 +2798,14 @@
           <w:rFonts w:cs="Times New Roman"/>
         </w:rPr>
       </w:pPr>
-      <w:bookmarkStart w:id="8" w:name="_Toc240811425"/>
+      <w:bookmarkStart w:id="9" w:name="_Toc240967343"/>
       <w:r>
         <w:rPr>
           <w:rFonts w:cs="Times New Roman"/>
         </w:rPr>
         <w:t>Logbog</w:t>
       </w:r>
-      <w:bookmarkEnd w:id="8"/>
+      <w:bookmarkEnd w:id="9"/>
     </w:p>
     <w:tbl>
       <w:tblPr>
@@ -4104,6 +4186,7 @@
                 <w:lang w:eastAsia="da-DK"/>
                 <w14:ligatures w14:val="none"/>
               </w:rPr>
+              <w:lastRenderedPageBreak/>
               <w:t>13-09-2026</w:t>
             </w:r>
           </w:p>
@@ -4442,18 +4525,7 @@
                 <w:lang w:eastAsia="da-DK"/>
                 <w14:ligatures w14:val="none"/>
               </w:rPr>
-              <w:t xml:space="preserve">Søgte efter en løsning og prøvede </w:t>
-            </w:r>
-            <w:r>
-              <w:rPr>
-                <w:rFonts w:eastAsia="Times New Roman" w:cs="Times New Roman"/>
-                <w:color w:val="000000"/>
-                <w:kern w:val="0"/>
-                <w:lang w:eastAsia="da-DK"/>
-                <w14:ligatures w14:val="none"/>
-              </w:rPr>
-              <w:lastRenderedPageBreak/>
-              <w:t>forskellige muligheder</w:t>
+              <w:t>Søgte efter en løsning og prøvede forskellige muligheder</w:t>
             </w:r>
           </w:p>
         </w:tc>
@@ -4486,7 +4558,6 @@
                 <w:lang w:eastAsia="da-DK"/>
                 <w14:ligatures w14:val="none"/>
               </w:rPr>
-              <w:lastRenderedPageBreak/>
               <w:t>L</w:t>
             </w:r>
           </w:p>
@@ -6064,14 +6135,15 @@
           <w:rFonts w:cs="Times New Roman"/>
         </w:rPr>
       </w:pPr>
-      <w:bookmarkStart w:id="9" w:name="_Toc240811426"/>
-      <w:r>
-        <w:rPr>
-          <w:rFonts w:cs="Times New Roman"/>
-        </w:rPr>
+      <w:bookmarkStart w:id="10" w:name="_Toc240967344"/>
+      <w:r>
+        <w:rPr>
+          <w:rFonts w:cs="Times New Roman"/>
+        </w:rPr>
+        <w:lastRenderedPageBreak/>
         <w:t>Prioritering</w:t>
       </w:r>
-      <w:bookmarkEnd w:id="9"/>
+      <w:bookmarkEnd w:id="10"/>
     </w:p>
     <w:p>
       <w:pPr>
@@ -6080,7 +6152,7 @@
           <w:rFonts w:cs="Times New Roman"/>
         </w:rPr>
       </w:pPr>
-      <w:bookmarkStart w:id="10" w:name="_Toc240811427"/>
+      <w:bookmarkStart w:id="11" w:name="_Toc240967345"/>
       <w:proofErr w:type="spellStart"/>
       <w:r>
         <w:rPr>
@@ -6088,7 +6160,7 @@
         </w:rPr>
         <w:t>Moscow</w:t>
       </w:r>
-      <w:bookmarkEnd w:id="10"/>
+      <w:bookmarkEnd w:id="11"/>
       <w:proofErr w:type="spellEnd"/>
     </w:p>
     <w:p>
@@ -6129,14 +6201,7 @@
         <w:rPr>
           <w:rFonts w:cs="Times New Roman"/>
         </w:rPr>
-        <w:t xml:space="preserve">, blandt andet HTML, CSS, billeder og </w:t>
-      </w:r>
-      <w:r>
-        <w:rPr>
-          <w:rFonts w:cs="Times New Roman"/>
-        </w:rPr>
-        <w:lastRenderedPageBreak/>
-        <w:t xml:space="preserve">projektstyringsdelen. Under </w:t>
+        <w:t xml:space="preserve">, blandt andet HTML, CSS, billeder og projektstyringsdelen. Under </w:t>
       </w:r>
       <w:proofErr w:type="spellStart"/>
       <w:r>
@@ -6233,21 +6298,7 @@
         <w:rPr>
           <w:rFonts w:cs="Times New Roman"/>
         </w:rPr>
-        <w:t xml:space="preserve"> design var et krav, blev mobiltilpasning </w:t>
-      </w:r>
-      <w:proofErr w:type="gramStart"/>
-      <w:r>
-        <w:rPr>
-          <w:rFonts w:cs="Times New Roman"/>
-        </w:rPr>
-        <w:t>et Must</w:t>
-      </w:r>
-      <w:proofErr w:type="gramEnd"/>
-      <w:r>
-        <w:rPr>
-          <w:rFonts w:cs="Times New Roman"/>
-        </w:rPr>
-        <w:t xml:space="preserve"> have, og jeg måtte derfor ændre min prioritering.</w:t>
+        <w:t xml:space="preserve"> design var et krav, blev mobiltilpasning et Must have, og jeg måtte derfor ændre min prioritering.</w:t>
       </w:r>
     </w:p>
     <w:p>
@@ -7602,14 +7653,14 @@
           <w:rFonts w:cs="Times New Roman"/>
         </w:rPr>
       </w:pPr>
-      <w:bookmarkStart w:id="11" w:name="_Toc240811428"/>
+      <w:bookmarkStart w:id="12" w:name="_Toc240967346"/>
       <w:r>
         <w:rPr>
           <w:rFonts w:cs="Times New Roman"/>
         </w:rPr>
         <w:t>Refleksion</w:t>
       </w:r>
-      <w:bookmarkEnd w:id="11"/>
+      <w:bookmarkEnd w:id="12"/>
     </w:p>
     <w:p>
       <w:pPr>
@@ -7655,6 +7706,7 @@
         <w:rPr>
           <w:rFonts w:cs="Times New Roman"/>
         </w:rPr>
+        <w:lastRenderedPageBreak/>
         <w:t xml:space="preserve">CSS viste sig at være en endnu større opgave, og set i bakspejlet ville jeg vurdere den til en størrelse XL, hvis ikke XXL. Jeg vidste ikke fra starten, hvordan mit </w:t>
       </w:r>
       <w:proofErr w:type="spellStart"/>
@@ -7682,7 +7734,6 @@
         <w:rPr>
           <w:rFonts w:cs="Times New Roman"/>
         </w:rPr>
-        <w:lastRenderedPageBreak/>
         <w:t xml:space="preserve">Jeg fulgte ikke mit Ganttkort godt nok og kom derfor bagud i forhold til min oprindelige tidsplan. Jeg arbejdede lidt på projektet her og der, men lektier og arbejde kom også i vejen. Derfor blev jeg stresset den sidste uge, hvor det pludselig skulle gå stærkt. Havde jeg brugt </w:t>
       </w:r>
       <w:proofErr w:type="spellStart"/>
@@ -9803,6 +9854,95 @@
     </w:lvl>
   </w:abstractNum>
   <w:abstractNum w:abstractNumId="15" w15:restartNumberingAfterBreak="0">
+    <w:nsid w:val="66910373"/>
+    <w:multiLevelType w:val="hybridMultilevel"/>
+    <w:tmpl w:val="B0845BDA"/>
+    <w:lvl w:ilvl="0" w:tplc="0406000F">
+      <w:start w:val="1"/>
+      <w:numFmt w:val="decimal"/>
+      <w:lvlText w:val="%1."/>
+      <w:lvlJc w:val="left"/>
+      <w:pPr>
+        <w:ind w:left="720" w:hanging="360"/>
+      </w:pPr>
+      <w:rPr>
+        <w:rFonts w:hint="default"/>
+      </w:rPr>
+    </w:lvl>
+    <w:lvl w:ilvl="1" w:tplc="04060019" w:tentative="1">
+      <w:start w:val="1"/>
+      <w:numFmt w:val="lowerLetter"/>
+      <w:lvlText w:val="%2."/>
+      <w:lvlJc w:val="left"/>
+      <w:pPr>
+        <w:ind w:left="1440" w:hanging="360"/>
+      </w:pPr>
+    </w:lvl>
+    <w:lvl w:ilvl="2" w:tplc="0406001B" w:tentative="1">
+      <w:start w:val="1"/>
+      <w:numFmt w:val="lowerRoman"/>
+      <w:lvlText w:val="%3."/>
+      <w:lvlJc w:val="right"/>
+      <w:pPr>
+        <w:ind w:left="2160" w:hanging="180"/>
+      </w:pPr>
+    </w:lvl>
+    <w:lvl w:ilvl="3" w:tplc="0406000F" w:tentative="1">
+      <w:start w:val="1"/>
+      <w:numFmt w:val="decimal"/>
+      <w:lvlText w:val="%4."/>
+      <w:lvlJc w:val="left"/>
+      <w:pPr>
+        <w:ind w:left="2880" w:hanging="360"/>
+      </w:pPr>
+    </w:lvl>
+    <w:lvl w:ilvl="4" w:tplc="04060019" w:tentative="1">
+      <w:start w:val="1"/>
+      <w:numFmt w:val="lowerLetter"/>
+      <w:lvlText w:val="%5."/>
+      <w:lvlJc w:val="left"/>
+      <w:pPr>
+        <w:ind w:left="3600" w:hanging="360"/>
+      </w:pPr>
+    </w:lvl>
+    <w:lvl w:ilvl="5" w:tplc="0406001B" w:tentative="1">
+      <w:start w:val="1"/>
+      <w:numFmt w:val="lowerRoman"/>
+      <w:lvlText w:val="%6."/>
+      <w:lvlJc w:val="right"/>
+      <w:pPr>
+        <w:ind w:left="4320" w:hanging="180"/>
+      </w:pPr>
+    </w:lvl>
+    <w:lvl w:ilvl="6" w:tplc="0406000F" w:tentative="1">
+      <w:start w:val="1"/>
+      <w:numFmt w:val="decimal"/>
+      <w:lvlText w:val="%7."/>
+      <w:lvlJc w:val="left"/>
+      <w:pPr>
+        <w:ind w:left="5040" w:hanging="360"/>
+      </w:pPr>
+    </w:lvl>
+    <w:lvl w:ilvl="7" w:tplc="04060019" w:tentative="1">
+      <w:start w:val="1"/>
+      <w:numFmt w:val="lowerLetter"/>
+      <w:lvlText w:val="%8."/>
+      <w:lvlJc w:val="left"/>
+      <w:pPr>
+        <w:ind w:left="5760" w:hanging="360"/>
+      </w:pPr>
+    </w:lvl>
+    <w:lvl w:ilvl="8" w:tplc="0406001B" w:tentative="1">
+      <w:start w:val="1"/>
+      <w:numFmt w:val="lowerRoman"/>
+      <w:lvlText w:val="%9."/>
+      <w:lvlJc w:val="right"/>
+      <w:pPr>
+        <w:ind w:left="6480" w:hanging="180"/>
+      </w:pPr>
+    </w:lvl>
+  </w:abstractNum>
+  <w:abstractNum w:abstractNumId="16" w15:restartNumberingAfterBreak="0">
     <w:nsid w:val="76A85CA2"/>
     <w:multiLevelType w:val="multilevel"/>
     <w:tmpl w:val="F46EAA0C"/>
@@ -9997,7 +10137,7 @@
     <w:abstractNumId w:val="8"/>
   </w:num>
   <w:num w:numId="13" w16cid:durableId="486898831">
-    <w:abstractNumId w:val="15"/>
+    <w:abstractNumId w:val="16"/>
   </w:num>
   <w:num w:numId="14" w16cid:durableId="2110852747">
     <w:abstractNumId w:val="0"/>
@@ -10010,6 +10150,9 @@
   </w:num>
   <w:num w:numId="17" w16cid:durableId="759521889">
     <w:abstractNumId w:val="7"/>
+  </w:num>
+  <w:num w:numId="18" w16cid:durableId="13580980">
+    <w:abstractNumId w:val="15"/>
   </w:num>
 </w:numbering>
 </file>

</xml_diff>